<commit_message>
Updated Portfolio and Contact Issue
</commit_message>
<xml_diff>
--- a/src/assets/cv/Sanyog Rajbhandari CV.docx
+++ b/src/assets/cv/Sanyog Rajbhandari CV.docx
@@ -2125,7 +2125,7 @@
                                 <w:szCs w:val="16"/>
                                 <w:lang w:val="en-US"/>
                               </w:rPr>
-                              <w:t>(202</w:t>
+                              <w:t>(</w:t>
                             </w:r>
                             <w:r>
                               <w:rPr>
@@ -2134,7 +2134,7 @@
                                 <w:szCs w:val="16"/>
                                 <w:lang w:val="en-US"/>
                               </w:rPr>
-                              <w:t xml:space="preserve">5 Jan </w:t>
+                              <w:t xml:space="preserve">Jan </w:t>
                             </w:r>
                             <w:r>
                               <w:rPr>
@@ -2143,7 +2143,7 @@
                                 <w:szCs w:val="16"/>
                                 <w:lang w:val="en-US"/>
                               </w:rPr>
-                              <w:t>-</w:t>
+                              <w:t>202</w:t>
                             </w:r>
                             <w:r>
                               <w:rPr>
@@ -2152,7 +2152,34 @@
                                 <w:szCs w:val="16"/>
                                 <w:lang w:val="en-US"/>
                               </w:rPr>
-                              <w:t xml:space="preserve"> Present</w:t>
+                              <w:t>5</w:t>
+                            </w:r>
+                            <w:r>
+                              <w:rPr>
+                                <w:rFonts w:ascii="Poppins" w:hAnsi="Poppins" w:cs="Poppins"/>
+                                <w:sz w:val="16"/>
+                                <w:szCs w:val="16"/>
+                                <w:lang w:val="en-US"/>
+                              </w:rPr>
+                              <w:t>–</w:t>
+                            </w:r>
+                            <w:r>
+                              <w:rPr>
+                                <w:rFonts w:ascii="Poppins" w:hAnsi="Poppins" w:cs="Poppins"/>
+                                <w:sz w:val="16"/>
+                                <w:szCs w:val="16"/>
+                                <w:lang w:val="en-US"/>
+                              </w:rPr>
+                              <w:t xml:space="preserve"> </w:t>
+                            </w:r>
+                            <w:r>
+                              <w:rPr>
+                                <w:rFonts w:ascii="Poppins" w:hAnsi="Poppins" w:cs="Poppins"/>
+                                <w:sz w:val="16"/>
+                                <w:szCs w:val="16"/>
+                                <w:lang w:val="en-US"/>
+                              </w:rPr>
+                              <w:t>Mar 2026</w:t>
                             </w:r>
                             <w:r>
                               <w:rPr>
@@ -2385,7 +2412,7 @@
                           <w:szCs w:val="16"/>
                           <w:lang w:val="en-US"/>
                         </w:rPr>
-                        <w:t>(202</w:t>
+                        <w:t>(</w:t>
                       </w:r>
                       <w:r>
                         <w:rPr>
@@ -2394,7 +2421,7 @@
                           <w:szCs w:val="16"/>
                           <w:lang w:val="en-US"/>
                         </w:rPr>
-                        <w:t xml:space="preserve">5 Jan </w:t>
+                        <w:t xml:space="preserve">Jan </w:t>
                       </w:r>
                       <w:r>
                         <w:rPr>
@@ -2403,7 +2430,7 @@
                           <w:szCs w:val="16"/>
                           <w:lang w:val="en-US"/>
                         </w:rPr>
-                        <w:t>-</w:t>
+                        <w:t>202</w:t>
                       </w:r>
                       <w:r>
                         <w:rPr>
@@ -2412,7 +2439,34 @@
                           <w:szCs w:val="16"/>
                           <w:lang w:val="en-US"/>
                         </w:rPr>
-                        <w:t xml:space="preserve"> Present</w:t>
+                        <w:t>5</w:t>
+                      </w:r>
+                      <w:r>
+                        <w:rPr>
+                          <w:rFonts w:ascii="Poppins" w:hAnsi="Poppins" w:cs="Poppins"/>
+                          <w:sz w:val="16"/>
+                          <w:szCs w:val="16"/>
+                          <w:lang w:val="en-US"/>
+                        </w:rPr>
+                        <w:t>–</w:t>
+                      </w:r>
+                      <w:r>
+                        <w:rPr>
+                          <w:rFonts w:ascii="Poppins" w:hAnsi="Poppins" w:cs="Poppins"/>
+                          <w:sz w:val="16"/>
+                          <w:szCs w:val="16"/>
+                          <w:lang w:val="en-US"/>
+                        </w:rPr>
+                        <w:t xml:space="preserve"> </w:t>
+                      </w:r>
+                      <w:r>
+                        <w:rPr>
+                          <w:rFonts w:ascii="Poppins" w:hAnsi="Poppins" w:cs="Poppins"/>
+                          <w:sz w:val="16"/>
+                          <w:szCs w:val="16"/>
+                          <w:lang w:val="en-US"/>
+                        </w:rPr>
+                        <w:t>Mar 2026</w:t>
                       </w:r>
                       <w:r>
                         <w:rPr>
@@ -12817,6 +12871,7 @@
   <w:style w:type="character" w:default="1" w:styleId="DefaultParagraphFont">
     <w:name w:val="Default Paragraph Font"/>
     <w:uiPriority w:val="1"/>
+    <w:semiHidden/>
     <w:unhideWhenUsed/>
   </w:style>
   <w:style w:type="table" w:default="1" w:styleId="TableNormal">

</xml_diff>